<commit_message>
Update final report - Added Video URL
</commit_message>
<xml_diff>
--- a/Heart_Disease_MLOps_Assignment01_Report.docx
+++ b/Heart_Disease_MLOps_Assignment01_Report.docx
@@ -364,6 +364,77 @@
           <w:szCs w:val="32"/>
         </w:rPr>
       </w:pPr>
+      <w:r>
+        <w:rPr>
+          <w:rFonts w:ascii="Arial" w:hAnsi="Arial" w:cs="Arial"/>
+          <w:sz w:val="32"/>
+          <w:szCs w:val="32"/>
+        </w:rPr>
+        <w:t xml:space="preserve"> </w:t>
+      </w:r>
+    </w:p>
+    <w:p>
+      <w:pPr>
+        <w:jc w:val="center"/>
+        <w:rPr>
+          <w:rFonts w:ascii="Arial" w:hAnsi="Arial" w:cs="Arial"/>
+          <w:sz w:val="32"/>
+          <w:szCs w:val="32"/>
+        </w:rPr>
+      </w:pPr>
+    </w:p>
+    <w:p>
+      <w:pPr>
+        <w:jc w:val="center"/>
+        <w:rPr>
+          <w:rFonts w:ascii="Arial" w:hAnsi="Arial" w:cs="Arial"/>
+          <w:sz w:val="32"/>
+          <w:szCs w:val="32"/>
+        </w:rPr>
+      </w:pPr>
+      <w:r>
+        <w:rPr>
+          <w:rFonts w:ascii="Arial" w:hAnsi="Arial" w:cs="Arial"/>
+          <w:b/>
+          <w:bCs/>
+          <w:sz w:val="32"/>
+          <w:szCs w:val="32"/>
+          <w:u w:val="single"/>
+        </w:rPr>
+        <w:t>Video URL -</w:t>
+      </w:r>
+      <w:r>
+        <w:rPr>
+          <w:rFonts w:ascii="Arial" w:hAnsi="Arial" w:cs="Arial"/>
+          <w:sz w:val="32"/>
+          <w:szCs w:val="32"/>
+        </w:rPr>
+        <w:t xml:space="preserve"> </w:t>
+      </w:r>
+      <w:r>
+        <w:rPr>
+          <w:rFonts w:ascii="Arial" w:hAnsi="Arial" w:cs="Arial"/>
+          <w:sz w:val="32"/>
+          <w:szCs w:val="32"/>
+        </w:rPr>
+        <w:br/>
+      </w:r>
+      <w:r>
+        <w:rPr>
+          <w:rFonts w:ascii="Arial" w:hAnsi="Arial" w:cs="Arial"/>
+          <w:sz w:val="32"/>
+          <w:szCs w:val="32"/>
+        </w:rPr>
+        <w:br/>
+      </w:r>
+      <w:r>
+        <w:rPr>
+          <w:rFonts w:ascii="Arial" w:hAnsi="Arial" w:cs="Arial"/>
+          <w:sz w:val="32"/>
+          <w:szCs w:val="32"/>
+        </w:rPr>
+        <w:t>https://youtu.be/FhM8P_iZI0U</w:t>
+      </w:r>
       <w:r>
         <w:rPr>
           <w:rFonts w:ascii="Arial" w:hAnsi="Arial" w:cs="Arial"/>

</xml_diff>